<commit_message>
Populate SIC Capstone reports, remove old Report folder, and ignore it in git
</commit_message>
<xml_diff>
--- a/SIC_report/SIC_AI_Capstone Project_Action Plan.docx
+++ b/SIC_report/SIC_AI_Capstone Project_Action Plan.docx
@@ -477,24 +477,8 @@
             <w:vAlign w:val="center"/>
           </w:tcPr>
           <w:p>
-            <w:pPr>
-              <w:jc w:val="center"/>
-              <w:rPr>
-                <w:rFonts w:ascii="SamsungOne 700" w:hAnsi="SamsungOne 700" w:cs="Times New Roman"/>
-                <w:spacing w:val="-12"/>
-                <w:sz w:val="32"/>
-                <w:szCs w:val="32"/>
-              </w:rPr>
-            </w:pPr>
-            <w:r>
-              <w:rPr>
-                <w:rFonts w:ascii="SamsungOne 700" w:hAnsi="SamsungOne 700" w:cs="Times New Roman"/>
-                <w:color w:val="000000" w:themeColor="text1"/>
-                <w:spacing w:val="-12"/>
-                <w:sz w:val="32"/>
-                <w:szCs w:val="32"/>
-              </w:rPr>
-              <w:t>Big Data Course</w:t>
+            <w:r>
+              <w:t>AI Course</w:t>
             </w:r>
           </w:p>
         </w:tc>
@@ -548,25 +532,8 @@
             <w:vAlign w:val="center"/>
           </w:tcPr>
           <w:p>
-            <w:pPr>
-              <w:ind w:firstLineChars="50" w:firstLine="128"/>
-              <w:jc w:val="left"/>
-              <w:rPr>
-                <w:rFonts w:ascii="Times New Roman" w:hAnsi="Times New Roman" w:cs="Times New Roman"/>
-                <w:spacing w:val="-12"/>
-                <w:sz w:val="28"/>
-                <w:szCs w:val="28"/>
-              </w:rPr>
-            </w:pPr>
-            <w:r>
-              <w:rPr>
-                <w:rFonts w:ascii="SamsungOne 400" w:hAnsi="SamsungOne 400" w:cs="Times New Roman"/>
-                <w:color w:val="A6A6A6" w:themeColor="background1" w:themeShade="A6"/>
-                <w:spacing w:val="-12"/>
-                <w:sz w:val="28"/>
-                <w:szCs w:val="28"/>
-              </w:rPr>
-              <w:t>&lt;A name befitting your team’s character&gt;</w:t>
+            <w:r>
+              <w:t>Group 4 - Healthcare Analytics</w:t>
             </w:r>
           </w:p>
         </w:tc>
@@ -643,59 +610,8 @@
             <w:vAlign w:val="center"/>
           </w:tcPr>
           <w:p>
-            <w:pPr>
-              <w:ind w:firstLineChars="50" w:firstLine="128"/>
-              <w:jc w:val="left"/>
-              <w:rPr>
-                <w:rFonts w:ascii="SamsungOne 400" w:hAnsi="SamsungOne 400" w:cs="Times New Roman"/>
-                <w:color w:val="A6A6A6" w:themeColor="background1" w:themeShade="A6"/>
-                <w:spacing w:val="-12"/>
-                <w:sz w:val="28"/>
-                <w:szCs w:val="28"/>
-              </w:rPr>
-            </w:pPr>
-            <w:r>
-              <w:rPr>
-                <w:rFonts w:ascii="SamsungOne 400" w:hAnsi="SamsungOne 400" w:cs="Times New Roman"/>
-                <w:color w:val="A6A6A6" w:themeColor="background1" w:themeShade="A6"/>
-                <w:spacing w:val="-12"/>
-                <w:sz w:val="28"/>
-                <w:szCs w:val="28"/>
-              </w:rPr>
-              <w:t xml:space="preserve">&lt;Team leader&gt; </w:t>
-            </w:r>
-            <w:r>
-              <w:rPr>
-                <w:rFonts w:ascii="SamsungOne 400" w:hAnsi="SamsungOne 400" w:cs="Times New Roman" w:hint="eastAsia"/>
-                <w:color w:val="A6A6A6" w:themeColor="background1" w:themeShade="A6"/>
-                <w:spacing w:val="-12"/>
-                <w:sz w:val="28"/>
-                <w:szCs w:val="28"/>
-              </w:rPr>
-              <w:t>/</w:t>
-            </w:r>
-          </w:p>
-          <w:p>
-            <w:pPr>
-              <w:ind w:firstLineChars="50" w:firstLine="128"/>
-              <w:jc w:val="left"/>
-              <w:rPr>
-                <w:rFonts w:ascii="SamsungOne 400" w:hAnsi="SamsungOne 400" w:cs="Times New Roman"/>
-                <w:color w:val="A6A6A6" w:themeColor="background1" w:themeShade="A6"/>
-                <w:spacing w:val="-12"/>
-                <w:sz w:val="28"/>
-                <w:szCs w:val="28"/>
-              </w:rPr>
-            </w:pPr>
-            <w:r>
-              <w:rPr>
-                <w:rFonts w:ascii="SamsungOne 400" w:hAnsi="SamsungOne 400" w:cs="Times New Roman"/>
-                <w:color w:val="A6A6A6" w:themeColor="background1" w:themeShade="A6"/>
-                <w:spacing w:val="-12"/>
-                <w:sz w:val="28"/>
-                <w:szCs w:val="28"/>
-              </w:rPr>
-              <w:t>&lt;member 1&gt;, &lt;member 2&gt;, …</w:t>
+            <w:r>
+              <w:t>Nguyễn Nhật Bằng (Leader) / Vũ Thế Diện, Phạm Tuấn Ninh, Đức Thịnh, Nguyễn Văn Sơn</w:t>
             </w:r>
           </w:p>
         </w:tc>
@@ -749,35 +665,8 @@
             <w:vAlign w:val="center"/>
           </w:tcPr>
           <w:p>
-            <w:pPr>
-              <w:ind w:firstLineChars="50" w:firstLine="128"/>
-              <w:jc w:val="left"/>
-              <w:rPr>
-                <w:rFonts w:ascii="Times New Roman" w:hAnsi="Times New Roman" w:cs="Times New Roman"/>
-                <w:spacing w:val="-12"/>
-                <w:sz w:val="28"/>
-                <w:szCs w:val="28"/>
-              </w:rPr>
-            </w:pPr>
-            <w:r>
-              <w:rPr>
-                <w:rFonts w:ascii="SamsungOne 400" w:hAnsi="SamsungOne 400" w:cs="Times New Roman" w:hint="eastAsia"/>
-                <w:color w:val="A6A6A6" w:themeColor="background1" w:themeShade="A6"/>
-                <w:spacing w:val="-12"/>
-                <w:sz w:val="28"/>
-                <w:szCs w:val="28"/>
-              </w:rPr>
-              <w:t>&lt;</w:t>
-            </w:r>
-            <w:r>
-              <w:rPr>
-                <w:rFonts w:ascii="SamsungOne 400" w:hAnsi="SamsungOne 400" w:cs="Times New Roman"/>
-                <w:color w:val="A6A6A6" w:themeColor="background1" w:themeShade="A6"/>
-                <w:spacing w:val="-12"/>
-                <w:sz w:val="28"/>
-                <w:szCs w:val="28"/>
-              </w:rPr>
-              <w:t>A deserving title for your project.&gt;</w:t>
+            <w:r>
+              <w:t>An Integrated Multi-Source Machine Learning Framework for Stroke Risk Prediction with Synthetic Energy Expenditure Estimation</w:t>
             </w:r>
           </w:p>
         </w:tc>
@@ -867,24 +756,14 @@
             <w:vAlign w:val="center"/>
           </w:tcPr>
           <w:p>
-            <w:pPr>
-              <w:ind w:leftChars="138" w:left="279" w:hangingChars="1" w:hanging="3"/>
-              <w:rPr>
-                <w:rFonts w:ascii="Times New Roman" w:hAnsi="Times New Roman" w:cs="Times New Roman"/>
-                <w:spacing w:val="-12"/>
-                <w:sz w:val="28"/>
-                <w:szCs w:val="28"/>
-              </w:rPr>
-            </w:pPr>
-            <w:r>
-              <w:rPr>
-                <w:rFonts w:ascii="SamsungOne 400" w:hAnsi="SamsungOne 400" w:cs="Times New Roman"/>
-                <w:color w:val="A6A6A6" w:themeColor="background1" w:themeShade="A6"/>
-                <w:spacing w:val="-12"/>
-                <w:sz w:val="28"/>
-                <w:szCs w:val="28"/>
-              </w:rPr>
-              <w:t>&lt;Itemize or describe in a few sentences the objective of your project.&gt;</w:t>
+            <w:r>
+              <w:t>1. Develop a high-accuracy early warning system for stroke risk using multi-source clinical data.</w:t>
+              <w:br/>
+              <w:t>2. Mitigate data leakage by enforcing patient-level deduplication and separation in preprocessing.</w:t>
+              <w:br/>
+              <w:t>3. Synthesize daily energy expenditure (Estimated Calories) using an auxiliary XGBoost Regressor model trained on physiological exercise logs.</w:t>
+              <w:br/>
+              <w:t>4. Transpile the finalized edge classifier into C++ code to support low-latency inference on clinical edge devices.</w:t>
             </w:r>
           </w:p>
         </w:tc>
@@ -959,34 +838,8 @@
             <w:vAlign w:val="center"/>
           </w:tcPr>
           <w:p>
-            <w:pPr>
-              <w:ind w:leftChars="139" w:left="278"/>
-              <w:rPr>
-                <w:rFonts w:ascii="Times New Roman" w:hAnsi="Times New Roman" w:cs="Times New Roman"/>
-                <w:spacing w:val="-12"/>
-                <w:sz w:val="28"/>
-                <w:szCs w:val="28"/>
-              </w:rPr>
-            </w:pPr>
-            <w:r>
-              <w:rPr>
-                <w:rFonts w:ascii="SamsungOne 400" w:hAnsi="SamsungOne 400" w:cs="Times New Roman"/>
-                <w:color w:val="A6A6A6" w:themeColor="background1" w:themeShade="A6"/>
-                <w:spacing w:val="-12"/>
-                <w:sz w:val="28"/>
-                <w:szCs w:val="28"/>
-              </w:rPr>
-              <w:t>&lt;</w:t>
-            </w:r>
-            <w:r>
-              <w:rPr>
-                <w:rFonts w:ascii="SamsungOne 400" w:hAnsi="SamsungOne 400" w:cs="Times New Roman"/>
-                <w:color w:val="A6A6A6" w:themeColor="background1" w:themeShade="A6"/>
-                <w:spacing w:val="-12"/>
-                <w:sz w:val="28"/>
-                <w:szCs w:val="28"/>
-              </w:rPr>
-              <w:t>The abstract of your project in a few sentences.&gt;</w:t>
+            <w:r>
+              <w:t>This project presents an integrated machine learning framework for reliable early-stage stroke risk prediction. By applying patient-level deduplication to a multi-source clinical dataset, we establish a leak-free baseline. We introduce physical activity level estimation by training an auxiliary XGBoost Regressor on exercise logs to synthesize daily energy expenditure as a proxy biomarker. We then evaluate and optimize multiple clinical classifiers. The Stacking Calibrated Sigmoid classifier achieves a recall of 92.11% on the held-out test set, minimizing missed diagnoses. We deploy the pipeline as a zero-dependency C++ binary for edge clinical environments.</w:t>
             </w:r>
           </w:p>
         </w:tc>
@@ -1063,24 +916,14 @@
             <w:vAlign w:val="center"/>
           </w:tcPr>
           <w:p>
-            <w:pPr>
-              <w:ind w:leftChars="139" w:left="278" w:firstLine="1"/>
-              <w:rPr>
-                <w:rFonts w:ascii="Times New Roman" w:hAnsi="Times New Roman" w:cs="Times New Roman"/>
-                <w:spacing w:val="-12"/>
-                <w:sz w:val="28"/>
-                <w:szCs w:val="28"/>
-              </w:rPr>
-            </w:pPr>
-            <w:r>
-              <w:rPr>
-                <w:rFonts w:ascii="SamsungOne 400" w:hAnsi="SamsungOne 400" w:cs="Times New Roman"/>
-                <w:color w:val="A6A6A6" w:themeColor="background1" w:themeShade="A6"/>
-                <w:spacing w:val="-12"/>
-                <w:sz w:val="28"/>
-                <w:szCs w:val="28"/>
-              </w:rPr>
-              <w:t>&lt;An explanation about the methodology you plan to apply.&gt;</w:t>
+            <w:r>
+              <w:t>1. Data Preprocessing: deduplication, clinical bounds mapping for BMI, missing values median imputation.</w:t>
+              <w:br/>
+              <w:t>2. Behavioral Synthesis: train an XGBoost Regressor on the calories dataset; predict energy expenditure for the stroke cohort.</w:t>
+              <w:br/>
+              <w:t>3. Classifier Modeling: train LR, RF, ET, GB, HGB, and XGBoost; combine best models under a Stacking Classifier; optimize decision threshold on validation set to maximize recall.</w:t>
+              <w:br/>
+              <w:t>4. Interpretability &amp; Edge Deployment: run SHAP feature importance; transpile decision logic into a clean header file for C++ compilation.</w:t>
             </w:r>
           </w:p>
         </w:tc>
@@ -1186,45 +1029,10 @@
             <w:vAlign w:val="center"/>
           </w:tcPr>
           <w:p>
-            <w:pPr>
-              <w:ind w:leftChars="139" w:left="278"/>
-              <w:rPr>
-                <w:rFonts w:ascii="SamsungOne 400" w:hAnsi="SamsungOne 400" w:cs="Times New Roman"/>
-                <w:color w:val="A6A6A6" w:themeColor="background1" w:themeShade="A6"/>
-                <w:spacing w:val="-12"/>
-                <w:sz w:val="28"/>
-                <w:szCs w:val="28"/>
-              </w:rPr>
-            </w:pPr>
-            <w:r>
-              <w:rPr>
-                <w:rFonts w:ascii="SamsungOne 400" w:hAnsi="SamsungOne 400" w:cs="Times New Roman"/>
-                <w:color w:val="A6A6A6" w:themeColor="background1" w:themeShade="A6"/>
-                <w:spacing w:val="-12"/>
-                <w:sz w:val="28"/>
-                <w:szCs w:val="28"/>
-              </w:rPr>
-              <w:t xml:space="preserve">&lt;Explain about the data. How and where do you plan to acquire it? </w:t>
-            </w:r>
-            <w:r>
-              <w:rPr>
-                <w:rFonts w:ascii="SamsungOne 400" w:hAnsi="SamsungOne 400" w:cs="Times New Roman"/>
-                <w:color w:val="A6A6A6" w:themeColor="background1" w:themeShade="A6"/>
-                <w:spacing w:val="-12"/>
-                <w:sz w:val="28"/>
-                <w:szCs w:val="28"/>
-              </w:rPr>
+            <w:r>
+              <w:t>1. Stroke Cohort Dataset (Stroke_dt.csv): contains 143,960 records representing patient demographic, history, and physiological parameters. Patient-level deduplication yields 5,110 unique patient profiles (70% train, 15% val, 15% test).</w:t>
               <w:br/>
-            </w:r>
-            <w:r>
-              <w:rPr>
-                <w:rFonts w:ascii="SamsungOne 400" w:hAnsi="SamsungOne 400" w:cs="Times New Roman"/>
-                <w:color w:val="A6A6A6" w:themeColor="background1" w:themeShade="A6"/>
-                <w:spacing w:val="-12"/>
-                <w:sz w:val="28"/>
-                <w:szCs w:val="28"/>
-              </w:rPr>
-              <w:t>How do you plan to use it?&gt;</w:t>
+              <w:t>2. Auxiliary Calories Dataset (calories.csv): contains 15,000 physiological exercise logs used to train the daily energy expenditure predictor.</w:t>
             </w:r>
           </w:p>
         </w:tc>
@@ -1320,46 +1128,12 @@
             <w:vAlign w:val="center"/>
           </w:tcPr>
           <w:p>
-            <w:pPr>
-              <w:ind w:leftChars="139" w:left="278"/>
-              <w:rPr>
-                <w:rFonts w:ascii="SamsungOne 400" w:hAnsi="SamsungOne 400" w:cs="Times New Roman"/>
-                <w:color w:val="A6A6A6" w:themeColor="background1" w:themeShade="A6"/>
-                <w:spacing w:val="-12"/>
-                <w:sz w:val="28"/>
-                <w:szCs w:val="28"/>
-              </w:rPr>
-            </w:pPr>
-            <w:r>
-              <w:rPr>
-                <w:rFonts w:ascii="SamsungOne 400" w:hAnsi="SamsungOne 400" w:cs="Times New Roman"/>
-                <w:color w:val="A6A6A6" w:themeColor="background1" w:themeShade="A6"/>
-                <w:spacing w:val="-12"/>
-                <w:sz w:val="28"/>
-                <w:szCs w:val="28"/>
-              </w:rPr>
-              <w:t>&lt; Describe in a few sentences the outcome you expect from your project.&gt;</w:t>
-            </w:r>
-          </w:p>
-          <w:p>
-            <w:pPr>
-              <w:ind w:leftChars="139" w:left="278"/>
-              <w:rPr>
-                <w:rFonts w:ascii="Times New Roman" w:hAnsi="Times New Roman" w:cs="Times New Roman"/>
-                <w:spacing w:val="-12"/>
-                <w:sz w:val="28"/>
-                <w:szCs w:val="28"/>
-              </w:rPr>
-            </w:pPr>
-            <w:r>
-              <w:rPr>
-                <w:rFonts w:ascii="SamsungOne 400" w:hAnsi="SamsungOne 400" w:cs="Times New Roman"/>
-                <w:color w:val="A6A6A6" w:themeColor="background1" w:themeShade="A6"/>
-                <w:spacing w:val="-12"/>
-                <w:sz w:val="28"/>
-                <w:szCs w:val="28"/>
-              </w:rPr>
-              <w:t>&lt;Also explain about the benefits if such outcome were to be obtained.&gt;</w:t>
+            <w:r>
+              <w:t>1. A robust clinical classification pipeline predicting stroke risk with high recall (Recall &gt;= 90%).</w:t>
+              <w:br/>
+              <w:t>2. A clean, compiled C++ edge binary capable of performing patient screening in sub-milliseconds.</w:t>
+              <w:br/>
+              <w:t>3. Scientific article and reports validating the use of synthesized daily energy expenditure as a prognostic marker.</w:t>
             </w:r>
           </w:p>
         </w:tc>
@@ -1454,24 +1228,16 @@
             <w:vAlign w:val="center"/>
           </w:tcPr>
           <w:p>
-            <w:pPr>
-              <w:ind w:leftChars="138" w:left="279" w:hangingChars="1" w:hanging="3"/>
-              <w:rPr>
-                <w:rFonts w:ascii="Times New Roman" w:hAnsi="Times New Roman" w:cs="Times New Roman"/>
-                <w:spacing w:val="-12"/>
-                <w:sz w:val="28"/>
-                <w:szCs w:val="28"/>
-              </w:rPr>
-            </w:pPr>
-            <w:r>
-              <w:rPr>
-                <w:rFonts w:ascii="SamsungOne 400" w:hAnsi="SamsungOne 400" w:cs="Times New Roman"/>
-                <w:color w:val="A6A6A6" w:themeColor="background1" w:themeShade="A6"/>
-                <w:spacing w:val="-12"/>
-                <w:sz w:val="28"/>
-                <w:szCs w:val="28"/>
-              </w:rPr>
-              <w:t>&lt;The role assigned to each team member.&gt;</w:t>
+            <w:r>
+              <w:t>- Nguyễn Nhật Bằng (Leader): System architecture, Stacking Classifier implementation, C++ transpilation.</w:t>
+              <w:br/>
+              <w:t>- Vũ Thế Diện: Data cleaning, BMI outliers handling, calories regressor training.</w:t>
+              <w:br/>
+              <w:t>- Phạm Tuấn Ninh: Exploratory Data Analysis, univariate and multivariate visualizations.</w:t>
+              <w:br/>
+              <w:t>- Đức Thịnh: Literature review, clinical verification of features, writing report text.</w:t>
+              <w:br/>
+              <w:t>- Nguyễn Văn Sơn: SHAP analysis, ablation studies, C++ test cases verification.</w:t>
             </w:r>
           </w:p>
         </w:tc>
@@ -1577,47 +1343,16 @@
             <w:vAlign w:val="center"/>
           </w:tcPr>
           <w:p>
-            <w:pPr>
-              <w:ind w:leftChars="138" w:left="279" w:hangingChars="1" w:hanging="3"/>
-              <w:rPr>
-                <w:rFonts w:ascii="SamsungOne 400" w:hAnsi="SamsungOne 400" w:cs="Times New Roman"/>
-                <w:color w:val="A6A6A6" w:themeColor="background1" w:themeShade="A6"/>
-                <w:spacing w:val="-12"/>
-                <w:sz w:val="28"/>
-                <w:szCs w:val="28"/>
-              </w:rPr>
-            </w:pPr>
-            <w:r>
-              <w:rPr>
-                <w:rFonts w:ascii="SamsungOne 400" w:hAnsi="SamsungOne 400" w:cs="Times New Roman"/>
-                <w:color w:val="A6A6A6" w:themeColor="background1" w:themeShade="A6"/>
-                <w:spacing w:val="-12"/>
-                <w:sz w:val="28"/>
-                <w:szCs w:val="28"/>
-              </w:rPr>
-              <w:t>&lt;Provide a summarized schedule.&gt;</w:t>
-            </w:r>
-          </w:p>
-          <w:p>
-            <w:pPr>
-              <w:ind w:leftChars="138" w:left="279" w:hangingChars="1" w:hanging="3"/>
-              <w:rPr>
-                <w:rFonts w:ascii="Times New Roman" w:hAnsi="Times New Roman" w:cs="Times New Roman"/>
-                <w:color w:val="A6A6A6" w:themeColor="background1" w:themeShade="A6"/>
-                <w:spacing w:val="-12"/>
-                <w:sz w:val="28"/>
-                <w:szCs w:val="28"/>
-              </w:rPr>
-            </w:pPr>
-            <w:r>
-              <w:rPr>
-                <w:rFonts w:ascii="SamsungOne 400" w:hAnsi="SamsungOne 400" w:cs="Times New Roman"/>
-                <w:color w:val="A6A6A6" w:themeColor="background1" w:themeShade="A6"/>
-                <w:spacing w:val="-12"/>
-                <w:sz w:val="28"/>
-                <w:szCs w:val="28"/>
-              </w:rPr>
-              <w:t>&lt;Use the provided WBS workbook for more detailed action plan.&gt;</w:t>
+            <w:r>
+              <w:t>Weeks 1-2: Problem definition, literature review, and raw data collection.</w:t>
+              <w:br/>
+              <w:t>Weeks 3-4: Data Ingestion, patient-level deduplication, and EDA.</w:t>
+              <w:br/>
+              <w:t>Weeks 5-6: Calorie regression training and feature enrichment.</w:t>
+              <w:br/>
+              <w:t>Weeks 7-8: Model selection, hyperparameter tuning, and validation threshold optimization.</w:t>
+              <w:br/>
+              <w:t>Weeks 9-10: C++ edge transpilation, ONNX cross-verification, and final reporting.</w:t>
             </w:r>
           </w:p>
         </w:tc>

</xml_diff>